<commit_message>
docs: atualiza STATUS, CLAUDE.md e contexto para a próxima sessão
- STATUS: estado ao fim da sessão (git, produção, máquina), combinados de
  trabalho (PR/aprovação/deploy), próximos passos sugeridos e problemas do
  ambiente (Chrome headless via CDP, pkill -f, alerta CodeQL #12).
- CLAUDE.md: painel na stack; regras de PR, alertas de segurança e Console SQL.
- PROJECT_CONTEXT, SETUP_NOVA_MAQUINA e skill context-recovery atualizados.

Co-Authored-By: Claude Sonnet 5.5 <noreply@anthropic.com>
</commit_message>
<xml_diff>
--- a/docs/SETUP_NOVA_MAQUINA.docx
+++ b/docs/SETUP_NOVA_MAQUINA.docx
@@ -2,7 +2,7 @@
 <file path=word/document.xml><?xml version="1.0" encoding="utf-8"?>
 <w:document xmlns:w="http://schemas.openxmlformats.org/wordprocessingml/2006/main" xmlns:m="http://schemas.openxmlformats.org/officeDocument/2006/math" xmlns:r="http://schemas.openxmlformats.org/officeDocument/2006/relationships" xmlns:o="urn:schemas-microsoft-com:office:office" xmlns:v="urn:schemas-microsoft-com:vml" xmlns:w10="urn:schemas-microsoft-com:office:word" xmlns:a="http://schemas.openxmlformats.org/drawingml/2006/main" xmlns:pic="http://schemas.openxmlformats.org/drawingml/2006/picture" xmlns:wp="http://schemas.openxmlformats.org/drawingml/2006/wordprocessingDrawing">
   <w:body>
-    <w:bookmarkStart w:id="17" w:name="levando-o-laboratório-para-outra-máquina"/>
+    <w:bookmarkStart w:id="18" w:name="levando-o-laboratório-para-outra-máquina"/>
     <w:p>
       <w:pPr>
         <w:pStyle w:val="Heading1"/>
@@ -1682,7 +1682,7 @@
       </w:r>
     </w:p>
     <w:bookmarkEnd w:id="13"/>
-    <w:bookmarkStart w:id="14" w:name="Xab1728b150b1d5fc7f6241033274e0c49246003"/>
+    <w:bookmarkStart w:id="15" w:name="Xab1728b150b1d5fc7f6241033274e0c49246003"/>
     <w:p>
       <w:pPr>
         <w:pStyle w:val="Heading2"/>
@@ -1949,8 +1949,107 @@
         <w:t xml:space="preserve">.</w:t>
       </w:r>
     </w:p>
+    <w:bookmarkStart w:id="14" w:name="painel-de-aprendizado-opcional"/>
+    <w:p>
+      <w:pPr>
+        <w:pStyle w:val="Heading3"/>
+      </w:pPr>
+      <w:r>
+        <w:t xml:space="preserve">Painel de Aprendizado (opcional)</w:t>
+      </w:r>
+    </w:p>
+    <w:p>
+      <w:pPr>
+        <w:pStyle w:val="FirstParagraph"/>
+      </w:pPr>
+      <w:r>
+        <w:rPr>
+          <w:rStyle w:val="VerbatimChar"/>
+        </w:rPr>
+        <w:t xml:space="preserve">npm run painel</w:t>
+      </w:r>
+      <w:r>
+        <w:t xml:space="preserve"> </w:t>
+      </w:r>
+      <w:r>
+        <w:t xml:space="preserve">→ http://localhost:3100 (containers, Kubernetes e Console SQL). Precisa de</w:t>
+      </w:r>
+      <w:r>
+        <w:t xml:space="preserve"> </w:t>
+      </w:r>
+      <w:r>
+        <w:rPr>
+          <w:rStyle w:val="VerbatimChar"/>
+        </w:rPr>
+        <w:t xml:space="preserve">docker</w:t>
+      </w:r>
+      <w:r>
+        <w:t xml:space="preserve"> </w:t>
+      </w:r>
+      <w:r>
+        <w:t xml:space="preserve">e, para a aba Kubernetes, de</w:t>
+      </w:r>
+      <w:r>
+        <w:t xml:space="preserve"> </w:t>
+      </w:r>
+      <w:r>
+        <w:rPr>
+          <w:rStyle w:val="VerbatimChar"/>
+        </w:rPr>
+        <w:t xml:space="preserve">kubectl</w:t>
+      </w:r>
+      <w:r>
+        <w:t xml:space="preserve"> </w:t>
+      </w:r>
+      <w:r>
+        <w:t xml:space="preserve">com o cluster</w:t>
+      </w:r>
+      <w:r>
+        <w:t xml:space="preserve"> </w:t>
+      </w:r>
+      <w:r>
+        <w:rPr>
+          <w:rStyle w:val="VerbatimChar"/>
+        </w:rPr>
+        <w:t xml:space="preserve">labsystem</w:t>
+      </w:r>
+      <w:r>
+        <w:t xml:space="preserve"> </w:t>
+      </w:r>
+      <w:r>
+        <w:t xml:space="preserve">de pé; o Console SQL usa o Postgres do Compose (5151). Guia:</w:t>
+      </w:r>
+      <w:r>
+        <w:t xml:space="preserve"> </w:t>
+      </w:r>
+      <w:r>
+        <w:rPr>
+          <w:rStyle w:val="VerbatimChar"/>
+        </w:rPr>
+        <w:t xml:space="preserve">docs/PAINEL_APRENDIZADO.md</w:t>
+      </w:r>
+      <w:r>
+        <w:t xml:space="preserve">. Para verificar as telas sem a extensão do Chrome do Claude Code, use o</w:t>
+      </w:r>
+      <w:r>
+        <w:t xml:space="preserve"> </w:t>
+      </w:r>
+      <w:r>
+        <w:rPr>
+          <w:rStyle w:val="VerbatimChar"/>
+        </w:rPr>
+        <w:t xml:space="preserve">google-chrome --headless=new --remote-debugging-port=9333</w:t>
+      </w:r>
+      <w:r>
+        <w:t xml:space="preserve"> </w:t>
+      </w:r>
+      <w:r>
+        <w:t xml:space="preserve">e o protocolo CDP.</w:t>
+      </w:r>
+    </w:p>
     <w:bookmarkEnd w:id="14"/>
-    <w:bookmarkStart w:id="15" w:name="X28b96c12804386aa281362e0edfb1d025117bfc"/>
+    <w:bookmarkEnd w:id="15"/>
+    <w:bookmarkStart w:id="16" w:name="X28b96c12804386aa281362e0edfb1d025117bfc"/>
     <w:p>
       <w:pPr>
         <w:pStyle w:val="Heading2"/>
@@ -2294,8 +2393,8 @@
         </w:tc>
       </w:tr>
     </w:tbl>
-    <w:bookmarkEnd w:id="15"/>
-    <w:bookmarkStart w:id="16" w:name="X1aa94aa7aba5ee8771d2236eaea2778e783c682"/>
+    <w:bookmarkEnd w:id="16"/>
+    <w:bookmarkStart w:id="17" w:name="X1aa94aa7aba5ee8771d2236eaea2778e783c682"/>
     <w:p>
       <w:pPr>
         <w:pStyle w:val="Heading2"/>
@@ -2376,8 +2475,8 @@
         <w:t xml:space="preserve">.</w:t>
       </w:r>
     </w:p>
-    <w:bookmarkEnd w:id="16"/>
     <w:bookmarkEnd w:id="17"/>
+    <w:bookmarkEnd w:id="18"/>
     <w:sectPr>
       <w:footnotePr>
         <w:numRestart w:val="eachSect"/>

</xml_diff>